<commit_message>
Update Rendu 3_ rapport final V3.docx
</commit_message>
<xml_diff>
--- a/reports/Rendu 3_ rapport final V3.docx
+++ b/reports/Rendu 3_ rapport final V3.docx
@@ -235,6 +235,11 @@
         </w:rPr>
         <w:t xml:space="preserve">:</w:t>
       </w:r>
+      <w:r>
+        <w:rPr>
+          <w:rtl w:val="0"/>
+        </w:rPr>
+      </w:r>
     </w:p>
     <w:p>
       <w:pPr>
@@ -408,7 +413,32 @@
         <w:rPr>
           <w:rtl w:val="0"/>
         </w:rPr>
-        <w:t xml:space="preserve">Afin d’obtenir des données adaptées à l’entraînement des modèles, toutes les images ont subi un prétraitement adapté au type de modèle utilisé. Pour les méthodes de machine learning classiques, les images ont été converties en niveaux de gris puis aplaties afin de transformer chaque image en un vecteur exploitable par ces algorithmes. D’autres opérations de prétraitement ont également été appliquées selon les besoins des modèles, notamment le redimensionnement des images à une taille commune, ce qui permet d’obtenir des données homogènes et compatibles avec les différentes approches de modélisation utilisées dans le projet.</w:t>
+        <w:t xml:space="preserve">Afin d’obtenir des données adaptées à l’entraînement des modèles, toutes les images ont subi un prétraitement adapté au type de modèle utilisé. Pour les méthodes de machine learning classiques, les images ont été converties en niveaux de gris </w:t>
+      </w:r>
+      <w:sdt>
+        <w:sdtPr>
+          <w:id w:val="822592269"/>
+          <w:tag w:val="goog_rdk_0"/>
+        </w:sdtPr>
+        <w:sdtContent>
+          <w:commentRangeStart w:id="0"/>
+        </w:sdtContent>
+      </w:sdt>
+      <w:r>
+        <w:rPr>
+          <w:rtl w:val="0"/>
+        </w:rPr>
+        <w:t xml:space="preserve">ou couleur</w:t>
+      </w:r>
+      <w:commentRangeEnd w:id="0"/>
+      <w:r>
+        <w:commentReference w:id="0"/>
+      </w:r>
+      <w:r>
+        <w:rPr>
+          <w:rtl w:val="0"/>
+        </w:rPr>
+        <w:t xml:space="preserve"> puis aplaties afin de transformer chaque image en un vecteur exploitable par ces algorithmes. D’autres opérations de prétraitement ont également été appliquées selon les besoins des modèles, notamment le redimensionnement des images à une taille commune, ce qui permet d’obtenir des données homogènes et compatibles avec les différentes approches de modélisation utilisées dans le projet.</w:t>
       </w:r>
     </w:p>
     <w:p>
@@ -658,6 +688,11 @@
         </w:rPr>
         <w:t xml:space="preserve">comparaison des modèles expérimenté durant notre modélisation:</w:t>
       </w:r>
+      <w:r>
+        <w:rPr>
+          <w:rtl w:val="0"/>
+        </w:rPr>
+      </w:r>
     </w:p>
     <w:p>
       <w:pPr>
@@ -691,11 +726,29 @@
         <w:jc w:val="both"/>
         <w:rPr/>
       </w:pPr>
-      <w:r>
-        <w:rPr>
-          <w:rtl w:val="0"/>
-        </w:rPr>
-        <w:t xml:space="preserve">Le modèle Random Forest présente les meilleurs résultats parmi les méthodes classiques avec une accuracy de 0,85 et un rappel anomalie de 0,62, indiquant une détection plus stable des défauts. Toutefois, il reste moins performant lorsque les anomalies sont très fines ou difficiles à distinguer de la texture normale. Enfin, le modèle KNN atteint une accuracy correcte de 0,81, mais son rappel reste faible avec 0,20, ce qui signifie qu’il identifie mal les images contenant des défauts malgré un bon score global.</w:t>
+      <w:sdt>
+        <w:sdtPr>
+          <w:id w:val="-999219010"/>
+          <w:tag w:val="goog_rdk_1"/>
+        </w:sdtPr>
+        <w:sdtContent>
+          <w:commentRangeStart w:id="1"/>
+        </w:sdtContent>
+      </w:sdt>
+      <w:r>
+        <w:rPr>
+          <w:rtl w:val="0"/>
+        </w:rPr>
+        <w:t xml:space="preserve">Le modèle Random Forest présente les meilleurs résultats parmi les méthodes classiques avec une accuracy de 0,87 et un rappel anomalie de 0,86, indiquant une détection plus stable des défauts. Toutefois, il reste moins performant lorsque les anomalies sont très fines ou difficiles à distinguer de la texture normale. Enfin, le modèle KNN atteint une accuracy correcte de 0,85, mais son rappel reste faible avec 0,77, ce qui signifie qu’il identifie mal les images contenant des défauts malgré un bon score global.</w:t>
+      </w:r>
+      <w:commentRangeEnd w:id="1"/>
+      <w:r>
+        <w:commentReference w:id="1"/>
+      </w:r>
+      <w:r>
+        <w:rPr>
+          <w:rtl w:val="0"/>
+        </w:rPr>
       </w:r>
     </w:p>
     <w:p>
@@ -1483,7 +1536,7 @@
               <w:rPr>
                 <w:rtl w:val="0"/>
               </w:rPr>
-              <w:t xml:space="preserve">0,88</w:t>
+              <w:t xml:space="preserve">0,87</w:t>
             </w:r>
             <w:r>
               <w:rPr>
@@ -1669,7 +1722,7 @@
               <w:rPr>
                 <w:rtl w:val="0"/>
               </w:rPr>
-              <w:t xml:space="preserve">0,90</w:t>
+              <w:t xml:space="preserve">0,85</w:t>
             </w:r>
             <w:r>
               <w:rPr>
@@ -3071,6 +3124,11 @@
         </w:rPr>
         <w:t xml:space="preserve">   Recommandation du modèle final:</w:t>
       </w:r>
+      <w:r>
+        <w:rPr>
+          <w:rtl w:val="0"/>
+        </w:rPr>
+      </w:r>
     </w:p>
     <w:p>
       <w:pPr>
@@ -3130,7 +3188,7 @@
           <w:ilvl w:val="0"/>
           <w:numId w:val="1"/>
         </w:numPr>
-        <w:spacing w:after="0" w:afterAutospacing="0" w:before="240" w:line="360" w:lineRule="auto"/>
+        <w:spacing w:after="0" w:before="240" w:line="360" w:lineRule="auto"/>
         <w:ind w:left="720" w:hanging="360"/>
         <w:jc w:val="both"/>
         <w:rPr>
@@ -3146,6 +3204,11 @@
           <w:rtl w:val="0"/>
         </w:rPr>
         <w:t xml:space="preserve">Composition du pipeline classification binaire : </w:t>
+      </w:r>
+      <w:r>
+        <w:rPr>
+          <w:rtl w:val="0"/>
+        </w:rPr>
       </w:r>
     </w:p>
     <w:p>
@@ -3154,7 +3217,7 @@
           <w:ilvl w:val="0"/>
           <w:numId w:val="2"/>
         </w:numPr>
-        <w:spacing w:after="240" w:before="0" w:beforeAutospacing="0" w:line="360" w:lineRule="auto"/>
+        <w:spacing w:after="240" w:before="0" w:line="360" w:lineRule="auto"/>
         <w:ind w:left="1440" w:hanging="360"/>
         <w:jc w:val="both"/>
         <w:rPr>
@@ -3171,6 +3234,11 @@
         </w:rPr>
         <w:t xml:space="preserve">Modèle de classification binaire (transfert learning MobileNet):</w:t>
       </w:r>
+      <w:r>
+        <w:rPr>
+          <w:rtl w:val="0"/>
+        </w:rPr>
+      </w:r>
     </w:p>
     <w:p>
       <w:pPr>
@@ -3185,13 +3253,8 @@
         <w:t xml:space="preserve">L’analyse des courbes d’entraînement, notamment l’évolution de la loss et de la val-loss (figure 2), ainsi que des différentes métriques de performance, indique que le modèle a appris de manière stable sans signe important de surapprentissage. De plus, les visualisations obtenues avec la méthode Grad-CAM (figure 3) montrent que le modèle concentre correctement son attention sur les zones contenant les anomalies.</w:t>
       </w:r>
       <w:r>
-        <w:rPr>
-          <w:rtl w:val="0"/>
-        </w:rPr>
-      </w:r>
-      <w:r>
         <w:drawing>
-          <wp:anchor allowOverlap="1" behindDoc="1" distB="114300" distT="114300" distL="114300" distR="114300" hidden="0" layoutInCell="1" locked="0" relativeHeight="0" simplePos="0">
+          <wp:anchor allowOverlap="1" behindDoc="1" distB="0" distT="0" distL="0" distR="0" hidden="0" layoutInCell="1" locked="0" relativeHeight="0" simplePos="0">
             <wp:simplePos x="0" y="0"/>
             <wp:positionH relativeFrom="column">
               <wp:posOffset>781050</wp:posOffset>
@@ -3202,16 +3265,16 @@
             <wp:extent cx="4014788" cy="2801987"/>
             <wp:effectExtent b="0" l="0" r="0" t="0"/>
             <wp:wrapNone/>
-            <wp:docPr id="2" name="image1.png"/>
+            <wp:docPr id="7" name="image2.png"/>
             <a:graphic>
               <a:graphicData uri="http://schemas.openxmlformats.org/drawingml/2006/picture">
                 <pic:pic>
                   <pic:nvPicPr>
-                    <pic:cNvPr id="0" name="image1.png"/>
+                    <pic:cNvPr id="0" name="image2.png"/>
                     <pic:cNvPicPr preferRelativeResize="0"/>
                   </pic:nvPicPr>
                   <pic:blipFill>
-                    <a:blip r:embed="rId6"/>
+                    <a:blip r:embed="rId9"/>
                     <a:srcRect b="0" l="0" r="0" t="0"/>
                     <a:stretch>
                       <a:fillRect/>
@@ -3427,7 +3490,7 @@
           <wp:inline distB="114300" distT="114300" distL="114300" distR="114300">
             <wp:extent cx="5731200" cy="2273300"/>
             <wp:effectExtent b="0" l="0" r="0" t="0"/>
-            <wp:docPr id="6" name="image5.png"/>
+            <wp:docPr id="12" name="image5.png"/>
             <a:graphic>
               <a:graphicData uri="http://schemas.openxmlformats.org/drawingml/2006/picture">
                 <pic:pic>
@@ -3436,7 +3499,7 @@
                     <pic:cNvPicPr preferRelativeResize="0"/>
                   </pic:nvPicPr>
                   <pic:blipFill>
-                    <a:blip r:embed="rId7"/>
+                    <a:blip r:embed="rId10"/>
                     <a:srcRect b="0" l="0" r="0" t="0"/>
                     <a:stretch>
                       <a:fillRect/>
@@ -3506,6 +3569,11 @@
         </w:rPr>
         <w:t xml:space="preserve">Modèle de segmentation  (transfert learning ResNet):</w:t>
       </w:r>
+      <w:r>
+        <w:rPr>
+          <w:rtl w:val="0"/>
+        </w:rPr>
+      </w:r>
     </w:p>
     <w:p>
       <w:pPr>
@@ -3567,16 +3635,16 @@
           <wp:inline distB="114300" distT="114300" distL="114300" distR="114300">
             <wp:extent cx="5731200" cy="4457700"/>
             <wp:effectExtent b="0" l="0" r="0" t="0"/>
-            <wp:docPr id="5" name="image2.png"/>
+            <wp:docPr id="11" name="image3.png"/>
             <a:graphic>
               <a:graphicData uri="http://schemas.openxmlformats.org/drawingml/2006/picture">
                 <pic:pic>
                   <pic:nvPicPr>
-                    <pic:cNvPr id="0" name="image2.png"/>
+                    <pic:cNvPr id="0" name="image3.png"/>
                     <pic:cNvPicPr preferRelativeResize="0"/>
                   </pic:nvPicPr>
                   <pic:blipFill>
-                    <a:blip r:embed="rId8"/>
+                    <a:blip r:embed="rId11"/>
                     <a:srcRect b="0" l="0" r="0" t="0"/>
                     <a:stretch>
                       <a:fillRect/>
@@ -3834,6 +3902,11 @@
         </w:rPr>
         <w:t xml:space="preserve"> Composition pipeline Multi-classe(transfer learning MobileNet):</w:t>
       </w:r>
+      <w:r>
+        <w:rPr>
+          <w:rtl w:val="0"/>
+        </w:rPr>
+      </w:r>
     </w:p>
     <w:p>
       <w:pPr>
@@ -3917,7 +3990,7 @@
       </w:r>
       <w:r>
         <w:drawing>
-          <wp:anchor allowOverlap="1" behindDoc="1" distB="114300" distT="114300" distL="114300" distR="114300" hidden="0" layoutInCell="1" locked="0" relativeHeight="0" simplePos="0">
+          <wp:anchor allowOverlap="1" behindDoc="1" distB="0" distT="0" distL="0" distR="0" hidden="0" layoutInCell="1" locked="0" relativeHeight="0" simplePos="0">
             <wp:simplePos x="0" y="0"/>
             <wp:positionH relativeFrom="column">
               <wp:posOffset>238125</wp:posOffset>
@@ -3928,16 +4001,16 @@
             <wp:extent cx="5229225" cy="2057400"/>
             <wp:effectExtent b="12700" l="12700" r="12700" t="12700"/>
             <wp:wrapNone/>
-            <wp:docPr id="4" name="image6.png"/>
+            <wp:docPr id="8" name="image1.png"/>
             <a:graphic>
               <a:graphicData uri="http://schemas.openxmlformats.org/drawingml/2006/picture">
                 <pic:pic>
                   <pic:nvPicPr>
-                    <pic:cNvPr id="0" name="image6.png"/>
+                    <pic:cNvPr id="0" name="image1.png"/>
                     <pic:cNvPicPr preferRelativeResize="0"/>
                   </pic:nvPicPr>
                   <pic:blipFill>
-                    <a:blip r:embed="rId9"/>
+                    <a:blip r:embed="rId12"/>
                     <a:srcRect b="0" l="0" r="0" t="0"/>
                     <a:stretch>
                       <a:fillRect/>
@@ -4195,7 +4268,7 @@
       </w:r>
       <w:r>
         <w:drawing>
-          <wp:anchor allowOverlap="1" behindDoc="1" distB="114300" distT="114300" distL="114300" distR="114300" hidden="0" layoutInCell="1" locked="0" relativeHeight="0" simplePos="0">
+          <wp:anchor allowOverlap="1" behindDoc="1" distB="0" distT="0" distL="0" distR="0" hidden="0" layoutInCell="1" locked="0" relativeHeight="0" simplePos="0">
             <wp:simplePos x="0" y="0"/>
             <wp:positionH relativeFrom="column">
               <wp:posOffset>904875</wp:posOffset>
@@ -4206,16 +4279,16 @@
             <wp:extent cx="3900488" cy="5040177"/>
             <wp:effectExtent b="12700" l="12700" r="12700" t="12700"/>
             <wp:wrapNone/>
-            <wp:docPr id="3" name="image3.png"/>
+            <wp:docPr id="9" name="image6.png"/>
             <a:graphic>
               <a:graphicData uri="http://schemas.openxmlformats.org/drawingml/2006/picture">
                 <pic:pic>
                   <pic:nvPicPr>
-                    <pic:cNvPr id="0" name="image3.png"/>
+                    <pic:cNvPr id="0" name="image6.png"/>
                     <pic:cNvPicPr preferRelativeResize="0"/>
                   </pic:nvPicPr>
                   <pic:blipFill>
-                    <a:blip r:embed="rId10"/>
+                    <a:blip r:embed="rId13"/>
                     <a:srcRect b="0" l="0" r="0" t="0"/>
                     <a:stretch>
                       <a:fillRect/>
@@ -4599,7 +4672,7 @@
       </w:r>
       <w:r>
         <w:drawing>
-          <wp:anchor allowOverlap="1" behindDoc="1" distB="114300" distT="114300" distL="114300" distR="114300" hidden="0" layoutInCell="1" locked="0" relativeHeight="0" simplePos="0">
+          <wp:anchor allowOverlap="1" behindDoc="1" distB="0" distT="0" distL="0" distR="0" hidden="0" layoutInCell="1" locked="0" relativeHeight="0" simplePos="0">
             <wp:simplePos x="0" y="0"/>
             <wp:positionH relativeFrom="column">
               <wp:posOffset>600075</wp:posOffset>
@@ -4610,7 +4683,7 @@
             <wp:extent cx="4338638" cy="2458858"/>
             <wp:effectExtent b="12700" l="12700" r="12700" t="12700"/>
             <wp:wrapNone/>
-            <wp:docPr id="1" name="image4.png"/>
+            <wp:docPr id="10" name="image4.png"/>
             <a:graphic>
               <a:graphicData uri="http://schemas.openxmlformats.org/drawingml/2006/picture">
                 <pic:pic>
@@ -4619,7 +4692,7 @@
                     <pic:cNvPicPr preferRelativeResize="0"/>
                   </pic:nvPicPr>
                   <pic:blipFill>
-                    <a:blip r:embed="rId11"/>
+                    <a:blip r:embed="rId14"/>
                     <a:srcRect b="0" l="0" r="0" t="0"/>
                     <a:stretch>
                       <a:fillRect/>
@@ -5066,6 +5139,11 @@
         </w:rPr>
         <w:t xml:space="preserve">Application industrielle du pipeline:</w:t>
       </w:r>
+      <w:r>
+        <w:rPr>
+          <w:rtl w:val="0"/>
+        </w:rPr>
+      </w:r>
     </w:p>
     <w:p>
       <w:pPr>
@@ -5526,6 +5604,128 @@
     </w:sectPr>
   </w:body>
 </w:document>
+</file>
+
+<file path=word/comments.xml><?xml version="1.0" encoding="utf-8"?>
+<w:comments xmlns:mc="http://schemas.openxmlformats.org/markup-compatibility/2006" xmlns:o="urn:schemas-microsoft-com:office:office" xmlns:r="http://schemas.openxmlformats.org/officeDocument/2006/relationships" xmlns:m="http://schemas.openxmlformats.org/officeDocument/2006/math" xmlns:v="urn:schemas-microsoft-com:vml" xmlns:wp="http://schemas.openxmlformats.org/drawingml/2006/wordprocessingDrawing" xmlns:w10="urn:schemas-microsoft-com:office:word" xmlns:w="http://schemas.openxmlformats.org/wordprocessingml/2006/main" xmlns:wne="http://schemas.microsoft.com/office/word/2006/wordml" xmlns:sl="http://schemas.openxmlformats.org/schemaLibrary/2006/main" xmlns:a="http://schemas.openxmlformats.org/drawingml/2006/main" xmlns:pic="http://schemas.openxmlformats.org/drawingml/2006/picture" xmlns:c="http://schemas.openxmlformats.org/drawingml/2006/chart" xmlns:lc="http://schemas.openxmlformats.org/drawingml/2006/lockedCanvas" xmlns:dgm="http://schemas.openxmlformats.org/drawingml/2006/diagram" xmlns:wps="http://schemas.microsoft.com/office/word/2010/wordprocessingShape" xmlns:wpg="http://schemas.microsoft.com/office/word/2010/wordprocessingGroup" xmlns:w14="http://schemas.microsoft.com/office/word/2010/wordml" xmlns:w15="http://schemas.microsoft.com/office/word/2012/wordml" xmlns:w16="http://schemas.microsoft.com/office/word/2018/wordml" xmlns:w16cex="http://schemas.microsoft.com/office/word/2018/wordml/cex" xmlns:w16cid="http://schemas.microsoft.com/office/word/2016/wordml/cid" xmlns="http://schemas.microsoft.com/office/tasks/2019/documenttasks" xmlns:cr="http://schemas.microsoft.com/office/comments/2020/reactions">
+  <w:comment w:author="Karine Kavitha Nallatamby" w:id="0" w:date="2026-02-09T17:43:59Z">
+    <w:p>
+      <w:pPr>
+        <w:keepNext w:val="0"/>
+        <w:keepLines w:val="0"/>
+        <w:pageBreakBefore w:val="0"/>
+        <w:widowControl w:val="0"/>
+        <w:pBdr>
+          <w:top w:space="0" w:sz="0" w:val="nil"/>
+          <w:left w:space="0" w:sz="0" w:val="nil"/>
+          <w:bottom w:space="0" w:sz="0" w:val="nil"/>
+          <w:right w:space="0" w:sz="0" w:val="nil"/>
+          <w:between w:space="0" w:sz="0" w:val="nil"/>
+        </w:pBdr>
+        <w:shd w:fill="auto" w:val="clear"/>
+        <w:spacing w:after="0" w:before="0" w:line="240" w:lineRule="auto"/>
+        <w:ind w:left="0" w:right="0" w:firstLine="0"/>
+        <w:jc w:val="left"/>
+        <w:rPr>
+          <w:rFonts w:ascii="Arial" w:cs="Arial" w:eastAsia="Arial" w:hAnsi="Arial"/>
+          <w:b w:val="0"/>
+          <w:bCs w:val="0"/>
+          <w:i w:val="0"/>
+          <w:iCs w:val="0"/>
+          <w:smallCaps w:val="0"/>
+          <w:strike w:val="0"/>
+          <w:color w:val="000000"/>
+          <w:sz w:val="22"/>
+          <w:szCs w:val="22"/>
+          <w:u w:val="none"/>
+          <w:shd w:fill="auto" w:val="clear"/>
+          <w:vertAlign w:val="baseline"/>
+        </w:rPr>
+      </w:pPr>
+      <w:r>
+        <w:rPr>
+          <w:rFonts w:ascii="Arial" w:cs="Arial" w:eastAsia="Arial" w:hAnsi="Arial"/>
+          <w:b w:val="0"/>
+          <w:bCs w:val="0"/>
+          <w:i w:val="0"/>
+          <w:iCs w:val="0"/>
+          <w:smallCaps w:val="0"/>
+          <w:strike w:val="0"/>
+          <w:color w:val="000000"/>
+          <w:sz w:val="22"/>
+          <w:szCs w:val="22"/>
+          <w:u w:val="none"/>
+          <w:shd w:fill="auto" w:val="clear"/>
+          <w:vertAlign w:val="baseline"/>
+          <w:rtl w:val="0"/>
+        </w:rPr>
+        <w:t xml:space="preserve">Je fais l'analysis en couleur</w:t>
+      </w:r>
+    </w:p>
+  </w:comment>
+  <w:comment w:author="Karine Kavitha Nallatamby" w:id="1" w:date="2026-02-09T17:36:21Z">
+    <w:p>
+      <w:pPr>
+        <w:keepNext w:val="0"/>
+        <w:keepLines w:val="0"/>
+        <w:pageBreakBefore w:val="0"/>
+        <w:widowControl w:val="0"/>
+        <w:pBdr>
+          <w:top w:space="0" w:sz="0" w:val="nil"/>
+          <w:left w:space="0" w:sz="0" w:val="nil"/>
+          <w:bottom w:space="0" w:sz="0" w:val="nil"/>
+          <w:right w:space="0" w:sz="0" w:val="nil"/>
+          <w:between w:space="0" w:sz="0" w:val="nil"/>
+        </w:pBdr>
+        <w:shd w:fill="auto" w:val="clear"/>
+        <w:spacing w:after="0" w:before="0" w:line="240" w:lineRule="auto"/>
+        <w:ind w:left="0" w:right="0" w:firstLine="0"/>
+        <w:jc w:val="left"/>
+        <w:rPr>
+          <w:rFonts w:ascii="Arial" w:cs="Arial" w:eastAsia="Arial" w:hAnsi="Arial"/>
+          <w:b w:val="0"/>
+          <w:bCs w:val="0"/>
+          <w:i w:val="0"/>
+          <w:iCs w:val="0"/>
+          <w:smallCaps w:val="0"/>
+          <w:strike w:val="0"/>
+          <w:color w:val="000000"/>
+          <w:sz w:val="22"/>
+          <w:szCs w:val="22"/>
+          <w:u w:val="none"/>
+          <w:shd w:fill="auto" w:val="clear"/>
+          <w:vertAlign w:val="baseline"/>
+        </w:rPr>
+      </w:pPr>
+      <w:r>
+        <w:rPr>
+          <w:rFonts w:ascii="Arial" w:cs="Arial" w:eastAsia="Arial" w:hAnsi="Arial"/>
+          <w:b w:val="0"/>
+          <w:bCs w:val="0"/>
+          <w:i w:val="0"/>
+          <w:iCs w:val="0"/>
+          <w:smallCaps w:val="0"/>
+          <w:strike w:val="0"/>
+          <w:color w:val="000000"/>
+          <w:sz w:val="22"/>
+          <w:szCs w:val="22"/>
+          <w:u w:val="none"/>
+          <w:shd w:fill="auto" w:val="clear"/>
+          <w:vertAlign w:val="baseline"/>
+          <w:rtl w:val="0"/>
+        </w:rPr>
+        <w:t xml:space="preserve">Pour Random Forest et KNN, J'ai ajusté les valeurs du rappel comme indiqué dans le tableau suivant.</w:t>
+      </w:r>
+    </w:p>
+  </w:comment>
+</w:comments>
+</file>
+
+<file path=word/commentsExtended.xml><?xml version="1.0" encoding="utf-8"?>
+<w15:commentsEx xmlns:mc="http://schemas.openxmlformats.org/markup-compatibility/2006" xmlns:o="urn:schemas-microsoft-com:office:office" xmlns:r="http://schemas.openxmlformats.org/officeDocument/2006/relationships" xmlns:m="http://schemas.openxmlformats.org/officeDocument/2006/math" xmlns:v="urn:schemas-microsoft-com:vml" xmlns:wp="http://schemas.openxmlformats.org/drawingml/2006/wordprocessingDrawing" xmlns:w10="urn:schemas-microsoft-com:office:word" xmlns:w="http://schemas.openxmlformats.org/wordprocessingml/2006/main" xmlns:wne="http://schemas.microsoft.com/office/word/2006/wordml" xmlns:sl="http://schemas.openxmlformats.org/schemaLibrary/2006/main" xmlns:a="http://schemas.openxmlformats.org/drawingml/2006/main" xmlns:pic="http://schemas.openxmlformats.org/drawingml/2006/picture" xmlns:c="http://schemas.openxmlformats.org/drawingml/2006/chart" xmlns:lc="http://schemas.openxmlformats.org/drawingml/2006/lockedCanvas" xmlns:dgm="http://schemas.openxmlformats.org/drawingml/2006/diagram" xmlns:wps="http://schemas.microsoft.com/office/word/2010/wordprocessingShape" xmlns:wpg="http://schemas.microsoft.com/office/word/2010/wordprocessingGroup" xmlns:w14="http://schemas.microsoft.com/office/word/2010/wordml" xmlns:w15="http://schemas.microsoft.com/office/word/2012/wordml" xmlns:w16="http://schemas.microsoft.com/office/word/2018/wordml" xmlns:w16cex="http://schemas.microsoft.com/office/word/2018/wordml/cex" xmlns:w16cid="http://schemas.microsoft.com/office/word/2016/wordml/cid" xmlns="http://schemas.microsoft.com/office/tasks/2019/documenttasks" xmlns:cr="http://schemas.microsoft.com/office/comments/2020/reactions">
+  <w15:commentEx w15:paraId="00000120" w15:done="0"/>
+  <w15:commentEx w15:paraId="00000121" w15:done="0"/>
+</w15:commentsEx>
 </file>
 
 <file path=word/numbering.xml><?xml version="1.0" encoding="utf-8"?>
@@ -6247,6 +6447,36 @@
       <w:szCs w:val="52"/>
     </w:rPr>
   </w:style>
+  <w:style w:type="table" w:styleId="TableNormal" w:default="1">
+    <w:name w:val="TableNormal"/>
+    <w:tblPr>
+      <w:tblCellMar>
+        <w:top w:w="100.0" w:type="dxa"/>
+        <w:left w:w="100.0" w:type="dxa"/>
+        <w:bottom w:w="100.0" w:type="dxa"/>
+        <w:right w:w="100.0" w:type="dxa"/>
+      </w:tblCellMar>
+    </w:tblPr>
+  </w:style>
+  <w:style w:type="paragraph" w:styleId="Normal" w:default="1">
+    <w:name w:val="normal"/>
+  </w:style>
+  <w:style w:type="table" w:styleId="Table1">
+    <w:basedOn w:val="TableNormal"/>
+    <w:tblPr>
+      <w:tblStyleRowBandSize w:val="1"/>
+      <w:tblStyleColBandSize w:val="1"/>
+      <w:tblCellMar/>
+    </w:tblPr>
+  </w:style>
+  <w:style w:type="table" w:styleId="Table2">
+    <w:basedOn w:val="TableNormal"/>
+    <w:tblPr>
+      <w:tblStyleRowBandSize w:val="1"/>
+      <w:tblStyleColBandSize w:val="1"/>
+      <w:tblCellMar/>
+    </w:tblPr>
+  </w:style>
   <w:style w:type="paragraph" w:styleId="Subtitle">
     <w:name w:val="Subtitle"/>
     <w:basedOn w:val="Normal"/>
@@ -6271,7 +6501,12 @@
     <w:tblPr>
       <w:tblStyleRowBandSize w:val="1"/>
       <w:tblStyleColBandSize w:val="1"/>
-      <w:tblCellMar/>
+      <w:tblCellMar>
+        <w:top w:w="100.0" w:type="dxa"/>
+        <w:left w:w="100.0" w:type="dxa"/>
+        <w:bottom w:w="100.0" w:type="dxa"/>
+        <w:right w:w="100.0" w:type="dxa"/>
+      </w:tblCellMar>
     </w:tblPr>
   </w:style>
   <w:style w:type="table" w:styleId="Table2">
@@ -6279,7 +6514,12 @@
     <w:tblPr>
       <w:tblStyleRowBandSize w:val="1"/>
       <w:tblStyleColBandSize w:val="1"/>
-      <w:tblCellMar/>
+      <w:tblCellMar>
+        <w:top w:w="100.0" w:type="dxa"/>
+        <w:left w:w="100.0" w:type="dxa"/>
+        <w:bottom w:w="100.0" w:type="dxa"/>
+        <w:right w:w="100.0" w:type="dxa"/>
+      </w:tblCellMar>
     </w:tblPr>
   </w:style>
 </w:styles>
@@ -6603,4 +6843,19 @@
   </a:objectDefaults>
   <a:extraClrSchemeLst/>
 </a:theme>
+</file>
+
+<file path=customXML/item1.xml><?xml version="1.0" encoding="utf-8"?>
+<go:gDocsCustomXmlDataStorage xmlns:go="http://customooxmlschemas.google.com/" xmlns:r="http://schemas.openxmlformats.org/officeDocument/2006/relationships" uri="GoogleDocsCustomDataVersion2">
+  <go:docsCustomData xmlns:go="http://customooxmlschemas.google.com/" roundtripDataSignature="AMtx7mjq18MXgL+DWPGBh/+KgTrHdXK1vA==">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</go:docsCustomData>
+</go:gDocsCustomXmlDataStorage>
+</file>
+
+<file path=customXML/itemProps1.xml><?xml version="1.0" encoding="utf-8"?>
+<ds:datastoreItem xmlns:ds="http://schemas.openxmlformats.org/officeDocument/2006/customXml" ds:itemID="{11111111-1234-1234-1234-123412341234}">
+  <ds:schemaRefs>
+    <ds:schemaRef ds:uri="http://schemas.openxmlformats.org/officeDocument/2006/relationships"/>
+    <ds:schemaRef ds:uri="http://customooxmlschemas.google.com/"/>
+  </ds:schemaRefs>
+</ds:datastoreItem>
 </file>
</xml_diff>